<commit_message>
Presupuesto: datos bancarios y recuadro de firma rellenable
La hoja 2 gana un bloque "Datos bancarios" en la columna derecha, bajo los
materiales no incluidos: es el hueco que ya estaba libre, asi que el
documento sigue en dos hojas A4. Los recuadros de firma admiten ahora
nombre, DNI y lugar/fecha escritos sobre la raya, y una rubrica escaneada
sobre la linea de firma.

Los datos reservados (cuenta, DNI y rubrica) no se versionan: se leen de
docs/presupuesto/privado.json, que queda fuera de git. Sin ese fichero el
presupuesto y las dos plantillas se generan igual, con marcadores en la
cuenta y las firmas en blanco, que es la version que se publica aqui.

Co-Authored-By: Claude Opus 5 <noreply@anthropic.com>
Claude-Session: https://claude.ai/code/session_01GVkjTdfNcVVYYVU9z9WU8K
</commit_message>
<xml_diff>
--- a/docs/presupuesto/Plantilla_Presupuesto_GrupoSUMA.docx
+++ b/docs/presupuesto/Plantilla_Presupuesto_GrupoSUMA.docx
@@ -1371,6 +1371,146 @@
                 <w:szCs w:val="18"/>
               </w:rPr>
               <w:t xml:space="preserve">Mobiliario y equipos de funcionamiento de cocina</w:t>
+            </w:r>
+          </w:p>
+          <w:p>
+            <w:pPr>
+              <w:pBdr>
+                <w:bottom w:val="single" w:color="D7D2C8" w:sz="4" w:space="3"/>
+              </w:pBdr>
+              <w:spacing w:after="100" w:before="260"/>
+            </w:pPr>
+            <w:r>
+              <w:rPr>
+                <w:rFonts w:ascii="Arial" w:cs="Arial" w:eastAsia="Arial" w:hAnsi="Arial"/>
+                <w:b/>
+                <w:bCs/>
+                <w:color w:val="E3000F"/>
+                <w:spacing w:val="30"/>
+                <w:sz w:val="15"/>
+                <w:szCs w:val="15"/>
+              </w:rPr>
+              <w:t xml:space="preserve">DATOS BANCARIOS</w:t>
+            </w:r>
+          </w:p>
+          <w:p>
+            <w:pPr>
+              <w:tabs>
+                <w:tab w:val="left" w:pos="1100"/>
+              </w:tabs>
+              <w:spacing w:after="40" w:line="250"/>
+            </w:pPr>
+            <w:r>
+              <w:rPr>
+                <w:rFonts w:ascii="Arial" w:cs="Arial" w:eastAsia="Arial" w:hAnsi="Arial"/>
+                <w:color w:val="8A929B"/>
+                <w:spacing w:val="20"/>
+                <w:sz w:val="13"/>
+                <w:szCs w:val="13"/>
+              </w:rPr>
+              <w:t xml:space="preserve">BANCO</w:t>
+            </w:r>
+            <w:r>
+              <w:tab/>
+            </w:r>
+            <w:r>
+              <w:rPr>
+                <w:rFonts w:ascii="Arial" w:cs="Arial" w:eastAsia="Arial" w:hAnsi="Arial"/>
+                <w:color w:val="1B2733"/>
+                <w:sz w:val="18"/>
+                <w:szCs w:val="18"/>
+              </w:rPr>
+              <w:t xml:space="preserve">[entidad]</w:t>
+            </w:r>
+          </w:p>
+          <w:p>
+            <w:pPr>
+              <w:tabs>
+                <w:tab w:val="left" w:pos="1100"/>
+              </w:tabs>
+              <w:spacing w:after="40" w:line="250"/>
+            </w:pPr>
+            <w:r>
+              <w:rPr>
+                <w:rFonts w:ascii="Arial" w:cs="Arial" w:eastAsia="Arial" w:hAnsi="Arial"/>
+                <w:color w:val="8A929B"/>
+                <w:spacing w:val="20"/>
+                <w:sz w:val="13"/>
+                <w:szCs w:val="13"/>
+              </w:rPr>
+              <w:t xml:space="preserve">TITULAR</w:t>
+            </w:r>
+            <w:r>
+              <w:tab/>
+            </w:r>
+            <w:r>
+              <w:rPr>
+                <w:rFonts w:ascii="Arial" w:cs="Arial" w:eastAsia="Arial" w:hAnsi="Arial"/>
+                <w:color w:val="1B2733"/>
+                <w:sz w:val="18"/>
+                <w:szCs w:val="18"/>
+              </w:rPr>
+              <w:t xml:space="preserve">[titular de la cuenta]</w:t>
+            </w:r>
+          </w:p>
+          <w:p>
+            <w:pPr>
+              <w:tabs>
+                <w:tab w:val="left" w:pos="1100"/>
+              </w:tabs>
+              <w:spacing w:after="40" w:line="250"/>
+            </w:pPr>
+            <w:r>
+              <w:rPr>
+                <w:rFonts w:ascii="Arial" w:cs="Arial" w:eastAsia="Arial" w:hAnsi="Arial"/>
+                <w:color w:val="8A929B"/>
+                <w:spacing w:val="20"/>
+                <w:sz w:val="13"/>
+                <w:szCs w:val="13"/>
+              </w:rPr>
+              <w:t xml:space="preserve">IBAN</w:t>
+            </w:r>
+            <w:r>
+              <w:tab/>
+            </w:r>
+            <w:r>
+              <w:rPr>
+                <w:rFonts w:ascii="Arial" w:cs="Arial" w:eastAsia="Arial" w:hAnsi="Arial"/>
+                <w:color w:val="1B2733"/>
+                <w:sz w:val="18"/>
+                <w:szCs w:val="18"/>
+              </w:rPr>
+              <w:t xml:space="preserve">[ES00 0000 0000 0000 0000 0000]</w:t>
+            </w:r>
+          </w:p>
+          <w:p>
+            <w:pPr>
+              <w:tabs>
+                <w:tab w:val="left" w:pos="1100"/>
+              </w:tabs>
+              <w:spacing w:after="40" w:line="250"/>
+            </w:pPr>
+            <w:r>
+              <w:rPr>
+                <w:rFonts w:ascii="Arial" w:cs="Arial" w:eastAsia="Arial" w:hAnsi="Arial"/>
+                <w:color w:val="8A929B"/>
+                <w:spacing w:val="20"/>
+                <w:sz w:val="13"/>
+                <w:szCs w:val="13"/>
+              </w:rPr>
+              <w:t xml:space="preserve">SWIFT</w:t>
+            </w:r>
+            <w:r>
+              <w:tab/>
+            </w:r>
+            <w:r>
+              <w:rPr>
+                <w:rFonts w:ascii="Arial" w:cs="Arial" w:eastAsia="Arial" w:hAnsi="Arial"/>
+                <w:color w:val="1B2733"/>
+                <w:sz w:val="18"/>
+                <w:szCs w:val="18"/>
+              </w:rPr>
+              <w:t xml:space="preserve">[XXXXXXXXXXX]</w:t>
             </w:r>
           </w:p>
         </w:tc>

</xml_diff>